<commit_message>
fix(quiz): await durable workspace writes
</commit_message>
<xml_diff>
--- a/jackyun-portal/docs/sync-v5-full-data-recovery-progress-3.54.0-20261028.docx
+++ b/jackyun-portal/docs/sync-v5-full-data-recovery-progress-3.54.0-20261028.docx
@@ -334,7 +334,7 @@
     </w:p>
     <w:p>
       <w:r>
-        <w:t xml:space="preserve">本次增加 QuizWise active progress 记录，将题目、答案、当前位置、会话及服务端题目 ID 通过 workspaceStorage.flush() 持久化为 stable legacyQuiz v5 记录；IndexedDB 题目副本写入等待事务完成。已有工作区写入回执前保留待办；重新打开恢复在做测验，网络答案未确认时完成动作重试并保留本地进度。并修复了旧题目缓存先恢复、云端进度后到时被一次性恢复标志挡住的竞态，同时防止用户已开始新流程后被迟到的云端进度覆盖。此改动不将 Supabase quiz history / review 副作用假称已迁移。恢复/v5、备份、同步存储清单和版本专项套件 68/68 通过；QuizWise 桌面与移动浏览器场景 5/5 通过；TypeScript、定向 ESLint 和 Next.js webpack 生产构建通过。DOCX 转图因环境无 LibreOffice / soffice.exe 无法完成视觉核验。</w:t>
+        <w:t xml:space="preserve">本次增加 QuizWise active progress 记录，将题目、答案、当前位置、会话及服务端题目 ID 通过 workspaceStorage.flush() 持久化为 stable legacyQuiz v5 记录；IndexedDB 题目副本写入等待事务完成。会话、偏好、设置和本地历史也改为等待 workspace flush 后再确认；本机删除写入失败时不会先从界面移除记录。新增故障注入测试确认偏好和成绩写入会传播 IndexedDB 事务失败，不伪报成功。已有工作区写入回执前保留待办；重新打开恢复在做测验，网络答案未确认时完成动作重试并保留本地进度。并修复了旧题目缓存先恢复、云端进度后到时被一次性恢复标志挡住的竞态，同时防止用户已开始新流程后被迟到的云端进度覆盖。此改动不将 Supabase quiz history / review 副作用假称已迁移。恢复/v5、备份、同步存储清单和版本专项套件 69/69 通过；QuizWise 桌面与移动浏览器场景 5/5 通过；TypeScript、定向 ESLint 和 Next.js webpack 生产构建通过。DOCX 转图因环境无 LibreOffice / soffice.exe 无法完成视觉核验。</w:t>
       </w:r>
     </w:p>
     <w:p>
@@ -344,7 +344,7 @@
     </w:p>
     <w:p>
       <w:r>
-        <w:t xml:space="preserve">本次本地分支验证不是远端 CI 或生产部署证明。推送到 PR #169 后必须重新检查最新提交 SHA 对应的 GitHub workflow 与 Vercel Preview READY 状态；之前 PR #168 / 旧 head 的浏览器流程失败没有同 SHA origin/main 对照证据，不能据此认定历史基线或本次新增回归。本地正确工作树端口上 QuizWise 桌面与移动浏览器测试通过，但不替代 CI 全部 UI 流程，也不替代认证云端测试。</w:t>
+        <w:t xml:space="preserve">PR #169 前一提交 b78231c 的 workflow 40574090030 中，build、TypeScript/ESLint 与 Existing data safety regressions 通过；Run production UI flows 失败，失败项为 cue-search 等待“打开日程管理”按钮，以及 review-queue 等待“今天的复习完成了”标题。这两个页面不属于本次 QuizWise 改动，但没有同 SHA origin/main 对照，故只能记录为非同步 UI 失败、基线归因未证实，不能称为已证明的历史基线。本次最新提交推送后仍须核对新 SHA 的 CI 和 Vercel Preview；本机正确工作树端口上 QuizWise 测试通过不替代远端全量 UI 或认证云端测试。</w:t>
       </w:r>
     </w:p>
     <w:p>

</xml_diff>